<commit_message>
Add Google Search Console verification meta tag and update book files
</commit_message>
<xml_diff>
--- a/QuestioningMatter_COMPLETE.docx
+++ b/QuestioningMatter_COMPLETE.docx
@@ -16,7 +16,7 @@
           <w:sz w:val="56"/>
           <w:szCs w:val="56"/>
         </w:rPr>
-        <w:t>Questioning Matter</w:t>
+        <w:t>Matter That Questions Itself</w:t>
       </w:r>
     </w:p>
     <w:p>
@@ -277,7 +277,17 @@
           <w:sz w:val="22"/>
           <w:szCs w:val="22"/>
         </w:rPr>
-        <w:t>For that reason, this is not a closed work. It is an open invitation. It can be refuted, validated, or extended. Its value lies not in certainty but in the process of questioning it proposes.</w:t>
+        <w:t>For that reason, this is not a closed work. It is an open invitation. It can be refuted, validated, or extended. Its value lies not in certainty but in the process of questioning it prop</w:t>
+      </w:r>
+      <w:bookmarkStart w:id="0" w:name="_GoBack"/>
+      <w:bookmarkEnd w:id="0"/>
+      <w:r>
+        <w:rPr>
+          <w:rFonts w:ascii="Arial" w:hAnsi="Arial" w:eastAsia="Arial" w:cs="Arial"/>
+          <w:sz w:val="22"/>
+          <w:szCs w:val="22"/>
+        </w:rPr>
+        <w:t>oses.</w:t>
       </w:r>
     </w:p>
     <w:p>
@@ -349,7 +359,7 @@
           <w:sz w:val="22"/>
           <w:szCs w:val="22"/>
         </w:rPr>
-        <w:t>This work, Questioning Matter / La Materia que se Pregunta, together with the PAE framework (Epistemic Audit Protocol) and the SRCE engine (Spectral Rigidity Calibration Engine), is the intellectual property of Jorge Eduardo Bravo Chaves.</w:t>
+        <w:t>This work, Matter That Questions Itself / La Materia que se Pregunta, together with the PAE framework (Epistemic Audit Protocol) and the SRCE engine (Spectral Rigidity Calibration Engine), is the intellectual property of Jorge Eduardo Bravo Chaves.</w:t>
       </w:r>
     </w:p>
     <w:p>
@@ -742,7 +752,41 @@
           <w:sz w:val="22"/>
           <w:szCs w:val="22"/>
         </w:rPr>
-        <w:t>In addition to his technical work, he is the author of Questioning Matter and of the poetry collection Vida: Amor &amp; Depresión, where he explores human experience from an introspective and metacognitive perspective.</w:t>
+        <w:t xml:space="preserve">In addition to his technical work, he is the author of Matter </w:t>
+      </w:r>
+      <w:r>
+        <w:rPr>
+          <w:rFonts w:hint="default" w:cs="Arial"/>
+          <w:sz w:val="22"/>
+          <w:szCs w:val="22"/>
+          <w:lang w:val="es-CR"/>
+        </w:rPr>
+        <w:t>“</w:t>
+      </w:r>
+      <w:r>
+        <w:rPr>
+          <w:rFonts w:ascii="Arial" w:hAnsi="Arial" w:eastAsia="Arial" w:cs="Arial"/>
+          <w:sz w:val="22"/>
+          <w:szCs w:val="22"/>
+        </w:rPr>
+        <w:t>That Questions Itself</w:t>
+      </w:r>
+      <w:r>
+        <w:rPr>
+          <w:rFonts w:hint="default" w:cs="Arial"/>
+          <w:sz w:val="22"/>
+          <w:szCs w:val="22"/>
+          <w:lang w:val="es-CR"/>
+        </w:rPr>
+        <w:t>”, The Matter that decide, What is Genesis?</w:t>
+      </w:r>
+      <w:r>
+        <w:rPr>
+          <w:rFonts w:ascii="Arial" w:hAnsi="Arial" w:eastAsia="Arial" w:cs="Arial"/>
+          <w:sz w:val="22"/>
+          <w:szCs w:val="22"/>
+        </w:rPr>
+        <w:t xml:space="preserve"> and of the poetry collection Vida: Amor &amp; Depresión, where he explores human experience from an introspective and metacognitive perspective.</w:t>
       </w:r>
     </w:p>
     <w:p>
@@ -3983,7 +4027,7 @@
     </w:p>
     <w:p>
       <w:pPr>
-        <w:pStyle w:val="16"/>
+        <w:pStyle w:val="18"/>
         <w:numPr>
           <w:ilvl w:val="0"/>
           <w:numId w:val="1"/>
@@ -4001,7 +4045,7 @@
     </w:p>
     <w:p>
       <w:pPr>
-        <w:pStyle w:val="16"/>
+        <w:pStyle w:val="18"/>
         <w:numPr>
           <w:ilvl w:val="0"/>
           <w:numId w:val="1"/>
@@ -4019,7 +4063,7 @@
     </w:p>
     <w:p>
       <w:pPr>
-        <w:pStyle w:val="16"/>
+        <w:pStyle w:val="18"/>
         <w:numPr>
           <w:ilvl w:val="0"/>
           <w:numId w:val="1"/>
@@ -4037,7 +4081,7 @@
     </w:p>
     <w:p>
       <w:pPr>
-        <w:pStyle w:val="16"/>
+        <w:pStyle w:val="18"/>
         <w:numPr>
           <w:ilvl w:val="0"/>
           <w:numId w:val="1"/>
@@ -4055,7 +4099,7 @@
     </w:p>
     <w:p>
       <w:pPr>
-        <w:pStyle w:val="16"/>
+        <w:pStyle w:val="18"/>
         <w:numPr>
           <w:ilvl w:val="0"/>
           <w:numId w:val="1"/>
@@ -4073,7 +4117,7 @@
     </w:p>
     <w:p>
       <w:pPr>
-        <w:pStyle w:val="16"/>
+        <w:pStyle w:val="18"/>
         <w:numPr>
           <w:ilvl w:val="0"/>
           <w:numId w:val="1"/>
@@ -4091,7 +4135,7 @@
     </w:p>
     <w:p>
       <w:pPr>
-        <w:pStyle w:val="16"/>
+        <w:pStyle w:val="18"/>
         <w:numPr>
           <w:ilvl w:val="0"/>
           <w:numId w:val="1"/>
@@ -7842,7 +7886,7 @@
     </w:p>
     <w:p>
       <w:pPr>
-        <w:pStyle w:val="16"/>
+        <w:pStyle w:val="18"/>
         <w:numPr>
           <w:ilvl w:val="0"/>
           <w:numId w:val="1"/>
@@ -7860,7 +7904,7 @@
     </w:p>
     <w:p>
       <w:pPr>
-        <w:pStyle w:val="16"/>
+        <w:pStyle w:val="18"/>
         <w:numPr>
           <w:ilvl w:val="0"/>
           <w:numId w:val="1"/>
@@ -7878,7 +7922,7 @@
     </w:p>
     <w:p>
       <w:pPr>
-        <w:pStyle w:val="16"/>
+        <w:pStyle w:val="18"/>
         <w:numPr>
           <w:ilvl w:val="0"/>
           <w:numId w:val="1"/>
@@ -7896,7 +7940,7 @@
     </w:p>
     <w:p>
       <w:pPr>
-        <w:pStyle w:val="16"/>
+        <w:pStyle w:val="18"/>
         <w:numPr>
           <w:ilvl w:val="0"/>
           <w:numId w:val="1"/>
@@ -7914,7 +7958,7 @@
     </w:p>
     <w:p>
       <w:pPr>
-        <w:pStyle w:val="16"/>
+        <w:pStyle w:val="18"/>
         <w:numPr>
           <w:ilvl w:val="0"/>
           <w:numId w:val="1"/>
@@ -7932,7 +7976,7 @@
     </w:p>
     <w:p>
       <w:pPr>
-        <w:pStyle w:val="16"/>
+        <w:pStyle w:val="18"/>
         <w:numPr>
           <w:ilvl w:val="0"/>
           <w:numId w:val="1"/>
@@ -12839,7 +12883,7 @@
     </w:p>
     <w:p>
       <w:pPr>
-        <w:pStyle w:val="16"/>
+        <w:pStyle w:val="18"/>
         <w:numPr>
           <w:ilvl w:val="0"/>
           <w:numId w:val="1"/>
@@ -12857,7 +12901,7 @@
     </w:p>
     <w:p>
       <w:pPr>
-        <w:pStyle w:val="16"/>
+        <w:pStyle w:val="18"/>
         <w:numPr>
           <w:ilvl w:val="0"/>
           <w:numId w:val="1"/>
@@ -12875,7 +12919,7 @@
     </w:p>
     <w:p>
       <w:pPr>
-        <w:pStyle w:val="16"/>
+        <w:pStyle w:val="18"/>
         <w:numPr>
           <w:ilvl w:val="0"/>
           <w:numId w:val="1"/>
@@ -12893,7 +12937,7 @@
     </w:p>
     <w:p>
       <w:pPr>
-        <w:pStyle w:val="16"/>
+        <w:pStyle w:val="18"/>
         <w:numPr>
           <w:ilvl w:val="0"/>
           <w:numId w:val="1"/>
@@ -12911,7 +12955,7 @@
     </w:p>
     <w:p>
       <w:pPr>
-        <w:pStyle w:val="16"/>
+        <w:pStyle w:val="18"/>
         <w:numPr>
           <w:ilvl w:val="0"/>
           <w:numId w:val="1"/>
@@ -12929,7 +12973,7 @@
     </w:p>
     <w:p>
       <w:pPr>
-        <w:pStyle w:val="16"/>
+        <w:pStyle w:val="18"/>
         <w:numPr>
           <w:ilvl w:val="0"/>
           <w:numId w:val="1"/>
@@ -16868,7 +16912,7 @@
     </w:p>
     <w:p>
       <w:pPr>
-        <w:pStyle w:val="16"/>
+        <w:pStyle w:val="18"/>
         <w:numPr>
           <w:ilvl w:val="0"/>
           <w:numId w:val="1"/>
@@ -16886,7 +16930,7 @@
     </w:p>
     <w:p>
       <w:pPr>
-        <w:pStyle w:val="16"/>
+        <w:pStyle w:val="18"/>
         <w:numPr>
           <w:ilvl w:val="0"/>
           <w:numId w:val="1"/>
@@ -16904,7 +16948,7 @@
     </w:p>
     <w:p>
       <w:pPr>
-        <w:pStyle w:val="16"/>
+        <w:pStyle w:val="18"/>
         <w:numPr>
           <w:ilvl w:val="0"/>
           <w:numId w:val="1"/>
@@ -16922,7 +16966,7 @@
     </w:p>
     <w:p>
       <w:pPr>
-        <w:pStyle w:val="16"/>
+        <w:pStyle w:val="18"/>
         <w:numPr>
           <w:ilvl w:val="0"/>
           <w:numId w:val="1"/>
@@ -16940,7 +16984,7 @@
     </w:p>
     <w:p>
       <w:pPr>
-        <w:pStyle w:val="16"/>
+        <w:pStyle w:val="18"/>
         <w:numPr>
           <w:ilvl w:val="0"/>
           <w:numId w:val="1"/>
@@ -16958,7 +17002,7 @@
     </w:p>
     <w:p>
       <w:pPr>
-        <w:pStyle w:val="16"/>
+        <w:pStyle w:val="18"/>
         <w:numPr>
           <w:ilvl w:val="0"/>
           <w:numId w:val="1"/>
@@ -21332,7 +21376,7 @@
     </w:p>
     <w:p>
       <w:pPr>
-        <w:pStyle w:val="16"/>
+        <w:pStyle w:val="18"/>
         <w:numPr>
           <w:ilvl w:val="0"/>
           <w:numId w:val="1"/>
@@ -21350,7 +21394,7 @@
     </w:p>
     <w:p>
       <w:pPr>
-        <w:pStyle w:val="16"/>
+        <w:pStyle w:val="18"/>
         <w:numPr>
           <w:ilvl w:val="0"/>
           <w:numId w:val="1"/>
@@ -21368,7 +21412,7 @@
     </w:p>
     <w:p>
       <w:pPr>
-        <w:pStyle w:val="16"/>
+        <w:pStyle w:val="18"/>
         <w:numPr>
           <w:ilvl w:val="0"/>
           <w:numId w:val="1"/>
@@ -21386,7 +21430,7 @@
     </w:p>
     <w:p>
       <w:pPr>
-        <w:pStyle w:val="16"/>
+        <w:pStyle w:val="18"/>
         <w:numPr>
           <w:ilvl w:val="0"/>
           <w:numId w:val="1"/>
@@ -21404,7 +21448,7 @@
     </w:p>
     <w:p>
       <w:pPr>
-        <w:pStyle w:val="16"/>
+        <w:pStyle w:val="18"/>
         <w:numPr>
           <w:ilvl w:val="0"/>
           <w:numId w:val="1"/>
@@ -21422,7 +21466,7 @@
     </w:p>
     <w:p>
       <w:pPr>
-        <w:pStyle w:val="16"/>
+        <w:pStyle w:val="18"/>
         <w:numPr>
           <w:ilvl w:val="0"/>
           <w:numId w:val="1"/>
@@ -21440,7 +21484,7 @@
     </w:p>
     <w:p>
       <w:pPr>
-        <w:pStyle w:val="16"/>
+        <w:pStyle w:val="18"/>
         <w:numPr>
           <w:ilvl w:val="0"/>
           <w:numId w:val="1"/>
@@ -21458,7 +21502,7 @@
     </w:p>
     <w:p>
       <w:pPr>
-        <w:pStyle w:val="16"/>
+        <w:pStyle w:val="18"/>
         <w:numPr>
           <w:ilvl w:val="0"/>
           <w:numId w:val="1"/>
@@ -22959,7 +23003,7 @@
     </w:p>
     <w:p>
       <w:pPr>
-        <w:pStyle w:val="16"/>
+        <w:pStyle w:val="18"/>
         <w:numPr>
           <w:ilvl w:val="0"/>
           <w:numId w:val="1"/>
@@ -22977,7 +23021,7 @@
     </w:p>
     <w:p>
       <w:pPr>
-        <w:pStyle w:val="16"/>
+        <w:pStyle w:val="18"/>
         <w:numPr>
           <w:ilvl w:val="0"/>
           <w:numId w:val="1"/>
@@ -22995,7 +23039,7 @@
     </w:p>
     <w:p>
       <w:pPr>
-        <w:pStyle w:val="16"/>
+        <w:pStyle w:val="18"/>
         <w:numPr>
           <w:ilvl w:val="0"/>
           <w:numId w:val="1"/>
@@ -23013,7 +23057,7 @@
     </w:p>
     <w:p>
       <w:pPr>
-        <w:pStyle w:val="16"/>
+        <w:pStyle w:val="18"/>
         <w:numPr>
           <w:ilvl w:val="0"/>
           <w:numId w:val="1"/>
@@ -23031,7 +23075,7 @@
     </w:p>
     <w:p>
       <w:pPr>
-        <w:pStyle w:val="16"/>
+        <w:pStyle w:val="18"/>
         <w:numPr>
           <w:ilvl w:val="0"/>
           <w:numId w:val="1"/>
@@ -23049,7 +23093,7 @@
     </w:p>
     <w:p>
       <w:pPr>
-        <w:pStyle w:val="16"/>
+        <w:pStyle w:val="18"/>
         <w:numPr>
           <w:ilvl w:val="0"/>
           <w:numId w:val="1"/>
@@ -23067,7 +23111,7 @@
     </w:p>
     <w:p>
       <w:pPr>
-        <w:pStyle w:val="16"/>
+        <w:pStyle w:val="18"/>
         <w:numPr>
           <w:ilvl w:val="0"/>
           <w:numId w:val="1"/>
@@ -25403,12 +25447,6 @@
             <w:insideH w:val="single" w:color="auto" w:sz="4" w:space="0"/>
             <w:insideV w:val="single" w:color="auto" w:sz="4" w:space="0"/>
           </w:tblBorders>
-          <w:tblCellMar>
-            <w:top w:w="0" w:type="dxa"/>
-            <w:left w:w="10" w:type="dxa"/>
-            <w:bottom w:w="0" w:type="dxa"/>
-            <w:right w:w="10" w:type="dxa"/>
-          </w:tblCellMar>
         </w:tblPrEx>
         <w:trPr>
           <w:tblHeader/>
@@ -26080,6 +26118,12 @@
             <w:insideH w:val="single" w:color="auto" w:sz="4" w:space="0"/>
             <w:insideV w:val="single" w:color="auto" w:sz="4" w:space="0"/>
           </w:tblBorders>
+          <w:tblCellMar>
+            <w:top w:w="0" w:type="dxa"/>
+            <w:left w:w="10" w:type="dxa"/>
+            <w:bottom w:w="0" w:type="dxa"/>
+            <w:right w:w="10" w:type="dxa"/>
+          </w:tblCellMar>
         </w:tblPrEx>
         <w:tc>
           <w:tcPr>
@@ -26393,7 +26437,7 @@
     </w:p>
     <w:p>
       <w:pPr>
-        <w:pStyle w:val="16"/>
+        <w:pStyle w:val="18"/>
         <w:numPr>
           <w:ilvl w:val="0"/>
           <w:numId w:val="1"/>
@@ -26411,7 +26455,7 @@
     </w:p>
     <w:p>
       <w:pPr>
-        <w:pStyle w:val="16"/>
+        <w:pStyle w:val="18"/>
         <w:numPr>
           <w:ilvl w:val="0"/>
           <w:numId w:val="1"/>
@@ -26429,7 +26473,7 @@
     </w:p>
     <w:p>
       <w:pPr>
-        <w:pStyle w:val="16"/>
+        <w:pStyle w:val="18"/>
         <w:numPr>
           <w:ilvl w:val="0"/>
           <w:numId w:val="1"/>
@@ -26447,7 +26491,7 @@
     </w:p>
     <w:p>
       <w:pPr>
-        <w:pStyle w:val="16"/>
+        <w:pStyle w:val="18"/>
         <w:numPr>
           <w:ilvl w:val="0"/>
           <w:numId w:val="1"/>
@@ -26465,7 +26509,7 @@
     </w:p>
     <w:p>
       <w:pPr>
-        <w:pStyle w:val="16"/>
+        <w:pStyle w:val="18"/>
         <w:numPr>
           <w:ilvl w:val="0"/>
           <w:numId w:val="1"/>
@@ -26483,7 +26527,7 @@
     </w:p>
     <w:p>
       <w:pPr>
-        <w:pStyle w:val="16"/>
+        <w:pStyle w:val="18"/>
         <w:numPr>
           <w:ilvl w:val="0"/>
           <w:numId w:val="1"/>
@@ -26501,7 +26545,7 @@
     </w:p>
     <w:p>
       <w:pPr>
-        <w:pStyle w:val="16"/>
+        <w:pStyle w:val="18"/>
         <w:numPr>
           <w:ilvl w:val="0"/>
           <w:numId w:val="1"/>
@@ -28895,7 +28939,7 @@
     </w:p>
     <w:p>
       <w:pPr>
-        <w:pStyle w:val="16"/>
+        <w:pStyle w:val="18"/>
         <w:numPr>
           <w:ilvl w:val="0"/>
           <w:numId w:val="1"/>
@@ -28913,7 +28957,7 @@
     </w:p>
     <w:p>
       <w:pPr>
-        <w:pStyle w:val="16"/>
+        <w:pStyle w:val="18"/>
         <w:numPr>
           <w:ilvl w:val="0"/>
           <w:numId w:val="1"/>
@@ -28931,7 +28975,7 @@
     </w:p>
     <w:p>
       <w:pPr>
-        <w:pStyle w:val="16"/>
+        <w:pStyle w:val="18"/>
         <w:numPr>
           <w:ilvl w:val="0"/>
           <w:numId w:val="1"/>
@@ -28949,7 +28993,7 @@
     </w:p>
     <w:p>
       <w:pPr>
-        <w:pStyle w:val="16"/>
+        <w:pStyle w:val="18"/>
         <w:numPr>
           <w:ilvl w:val="0"/>
           <w:numId w:val="1"/>
@@ -28967,7 +29011,7 @@
     </w:p>
     <w:p>
       <w:pPr>
-        <w:pStyle w:val="16"/>
+        <w:pStyle w:val="18"/>
         <w:numPr>
           <w:ilvl w:val="0"/>
           <w:numId w:val="1"/>
@@ -28985,7 +29029,7 @@
     </w:p>
     <w:p>
       <w:pPr>
-        <w:pStyle w:val="16"/>
+        <w:pStyle w:val="18"/>
         <w:numPr>
           <w:ilvl w:val="0"/>
           <w:numId w:val="1"/>
@@ -29003,7 +29047,7 @@
     </w:p>
     <w:p>
       <w:pPr>
-        <w:pStyle w:val="16"/>
+        <w:pStyle w:val="18"/>
         <w:numPr>
           <w:ilvl w:val="0"/>
           <w:numId w:val="1"/>
@@ -29358,25 +29402,7 @@
           <w:sz w:val="22"/>
           <w:szCs w:val="22"/>
         </w:rPr>
-        <w:t xml:space="preserve">This book began with an apparently simple question: what is real? Eight </w:t>
-      </w:r>
-      <w:bookmarkStart w:id="0" w:name="_GoBack"/>
-      <w:r>
-        <w:rPr>
-          <w:rFonts w:ascii="Arial" w:hAnsi="Arial" w:eastAsia="Arial" w:cs="Arial"/>
-          <w:sz w:val="22"/>
-          <w:szCs w:val="22"/>
-        </w:rPr>
-        <w:t>chapter</w:t>
-      </w:r>
-      <w:bookmarkEnd w:id="0"/>
-      <w:r>
-        <w:rPr>
-          <w:rFonts w:ascii="Arial" w:hAnsi="Arial" w:eastAsia="Arial" w:cs="Arial"/>
-          <w:sz w:val="22"/>
-          <w:szCs w:val="22"/>
-        </w:rPr>
-        <w:t>s later, the question has not been fully answered — and that is exactly what should have occurred. The questions this book formulates are not the kind that are answered and filed away. They are the kind that are reformulated with greater precision as the argument advances.</w:t>
+        <w:t>This book began with an apparently simple question: what is real? Eight chapters later, the question has not been fully answered — and that is exactly what should have occurred. The questions this book formulates are not the kind that are answered and filed away. They are the kind that are reformulated with greater precision as the argument advances.</w:t>
       </w:r>
     </w:p>
     <w:p>
@@ -30640,7 +30666,7 @@
     </w:p>
     <w:p>
       <w:pPr>
-        <w:pStyle w:val="16"/>
+        <w:pStyle w:val="18"/>
         <w:numPr>
           <w:ilvl w:val="0"/>
           <w:numId w:val="1"/>
@@ -30658,7 +30684,7 @@
     </w:p>
     <w:p>
       <w:pPr>
-        <w:pStyle w:val="16"/>
+        <w:pStyle w:val="18"/>
         <w:numPr>
           <w:ilvl w:val="0"/>
           <w:numId w:val="1"/>
@@ -30676,7 +30702,7 @@
     </w:p>
     <w:p>
       <w:pPr>
-        <w:pStyle w:val="16"/>
+        <w:pStyle w:val="18"/>
         <w:numPr>
           <w:ilvl w:val="0"/>
           <w:numId w:val="1"/>
@@ -30694,7 +30720,7 @@
     </w:p>
     <w:p>
       <w:pPr>
-        <w:pStyle w:val="16"/>
+        <w:pStyle w:val="18"/>
         <w:numPr>
           <w:ilvl w:val="0"/>
           <w:numId w:val="1"/>
@@ -30712,7 +30738,7 @@
     </w:p>
     <w:p>
       <w:pPr>
-        <w:pStyle w:val="16"/>
+        <w:pStyle w:val="18"/>
         <w:numPr>
           <w:ilvl w:val="0"/>
           <w:numId w:val="1"/>
@@ -30730,7 +30756,7 @@
     </w:p>
     <w:p>
       <w:pPr>
-        <w:pStyle w:val="16"/>
+        <w:pStyle w:val="18"/>
         <w:numPr>
           <w:ilvl w:val="0"/>
           <w:numId w:val="1"/>
@@ -30787,7 +30813,33 @@
           <w:sz w:val="22"/>
           <w:szCs w:val="22"/>
         </w:rPr>
-        <w:t>Bravo Chaves, J. E. (2025–2026). Questioning Matter / La Materia que se Pregunta. Free distribution. CC BY-NC-SA 4.0.</w:t>
+        <w:t xml:space="preserve">Bravo Chaves, J. E. (2025–2026). </w:t>
+      </w:r>
+      <w:r>
+        <w:rPr>
+          <w:rFonts w:hint="default" w:ascii="Arial" w:hAnsi="Arial" w:eastAsia="Arial" w:cs="Arial"/>
+          <w:sz w:val="22"/>
+          <w:szCs w:val="22"/>
+          <w:lang w:val="es-CR"/>
+        </w:rPr>
+        <w:t xml:space="preserve">Matter that </w:t>
+      </w:r>
+      <w:r>
+        <w:rPr>
+          <w:rFonts w:hint="default" w:cs="Arial"/>
+          <w:sz w:val="22"/>
+          <w:szCs w:val="22"/>
+          <w:lang w:val="es-CR"/>
+        </w:rPr>
+        <w:t>Question Itself</w:t>
+      </w:r>
+      <w:r>
+        <w:rPr>
+          <w:rFonts w:ascii="Arial" w:hAnsi="Arial" w:eastAsia="Arial" w:cs="Arial"/>
+          <w:sz w:val="22"/>
+          <w:szCs w:val="22"/>
+        </w:rPr>
+        <w:t>/ La Materia que se Pregunta. Free distribution. CC BY-NC-SA 4.0.</w:t>
       </w:r>
     </w:p>
     <w:p>
@@ -30982,7 +31034,7 @@
         <w:sz w:val="18"/>
         <w:szCs w:val="18"/>
       </w:rPr>
-      <w:t xml:space="preserve">Questioning Matter  |  Chapter 1  |  </w:t>
+      <w:t xml:space="preserve">Matter That Questions Itself |  </w:t>
     </w:r>
     <w:r>
       <w:rPr>
@@ -31116,7 +31168,7 @@
   <w:docDefaults>
     <w:rPrDefault>
       <w:rPr>
-        <w:rFonts w:ascii="Arial" w:hAnsi="Arial" w:eastAsia="Arial" w:cs="Arial"/>
+        <w:rFonts w:ascii="Times New Roman" w:hAnsi="Times New Roman" w:eastAsia="SimSun" w:cs="Times New Roman"/>
       </w:rPr>
     </w:rPrDefault>
     <w:pPrDefault/>
@@ -31187,7 +31239,7 @@
     <w:lsdException w:qFormat="1" w:unhideWhenUsed="0" w:uiPriority="0" w:semiHidden="0" w:name="Title"/>
     <w:lsdException w:unhideWhenUsed="0" w:uiPriority="0" w:semiHidden="0" w:name="Closing"/>
     <w:lsdException w:unhideWhenUsed="0" w:uiPriority="0" w:semiHidden="0" w:name="Signature"/>
-    <w:lsdException w:unhideWhenUsed="0" w:uiPriority="0" w:name="Default Paragraph Font"/>
+    <w:lsdException w:qFormat="1" w:unhideWhenUsed="0" w:uiPriority="0" w:name="Default Paragraph Font"/>
     <w:lsdException w:unhideWhenUsed="0" w:uiPriority="0" w:semiHidden="0" w:name="Body Text"/>
     <w:lsdException w:unhideWhenUsed="0" w:uiPriority="0" w:semiHidden="0" w:name="Body Text Indent"/>
     <w:lsdException w:unhideWhenUsed="0" w:uiPriority="0" w:semiHidden="0" w:name="List Continue"/>
@@ -31225,7 +31277,7 @@
     <w:lsdException w:unhideWhenUsed="0" w:uiPriority="0" w:semiHidden="0" w:name="HTML Sample"/>
     <w:lsdException w:unhideWhenUsed="0" w:uiPriority="0" w:semiHidden="0" w:name="HTML Typewriter"/>
     <w:lsdException w:unhideWhenUsed="0" w:uiPriority="0" w:semiHidden="0" w:name="HTML Variable"/>
-    <w:lsdException w:unhideWhenUsed="0" w:uiPriority="0" w:name="Normal Table"/>
+    <w:lsdException w:qFormat="1" w:unhideWhenUsed="0" w:uiPriority="0" w:name="Normal Table"/>
     <w:lsdException w:unhideWhenUsed="0" w:uiPriority="0" w:semiHidden="0" w:name="annotation subject"/>
     <w:lsdException w:unhideWhenUsed="0" w:uiPriority="0" w:semiHidden="0" w:name="Table Simple 1"/>
     <w:lsdException w:unhideWhenUsed="0" w:uiPriority="0" w:semiHidden="0" w:name="Table Simple 2"/>
@@ -31379,11 +31431,13 @@
   <w:style w:type="character" w:default="1" w:styleId="8">
     <w:name w:val="Default Paragraph Font"/>
     <w:semiHidden/>
+    <w:qFormat/>
     <w:uiPriority w:val="0"/>
   </w:style>
   <w:style w:type="table" w:default="1" w:styleId="9">
     <w:name w:val="Normal Table"/>
     <w:semiHidden/>
+    <w:qFormat/>
     <w:uiPriority w:val="0"/>
     <w:tblPr>
       <w:tblCellMar>
@@ -31415,6 +31469,16 @@
     </w:rPr>
   </w:style>
   <w:style w:type="character" w:styleId="12">
+    <w:name w:val="Emphasis"/>
+    <w:basedOn w:val="8"/>
+    <w:qFormat/>
+    <w:uiPriority w:val="0"/>
+    <w:rPr>
+      <w:i/>
+      <w:iCs/>
+    </w:rPr>
+  </w:style>
+  <w:style w:type="character" w:styleId="13">
     <w:name w:val="Hyperlink"/>
     <w:unhideWhenUsed/>
     <w:uiPriority w:val="99"/>
@@ -31423,25 +31487,9 @@
       <w:u w:val="single"/>
     </w:rPr>
   </w:style>
-  <w:style w:type="paragraph" w:styleId="13">
+  <w:style w:type="paragraph" w:styleId="14">
     <w:name w:val="footnote text"/>
-    <w:link w:val="17"/>
-    <w:semiHidden/>
-    <w:unhideWhenUsed/>
-    <w:qFormat/>
-    <w:uiPriority w:val="99"/>
-    <w:pPr>
-      <w:spacing w:after="0" w:line="240" w:lineRule="auto"/>
-    </w:pPr>
-    <w:rPr>
-      <w:rFonts w:ascii="Arial" w:hAnsi="Arial" w:eastAsia="Arial" w:cs="Arial"/>
-      <w:sz w:val="20"/>
-      <w:szCs w:val="20"/>
-    </w:rPr>
-  </w:style>
-  <w:style w:type="paragraph" w:styleId="14">
-    <w:name w:val="endnote text"/>
-    <w:link w:val="18"/>
+    <w:link w:val="19"/>
     <w:semiHidden/>
     <w:unhideWhenUsed/>
     <w:qFormat/>
@@ -31456,6 +31504,33 @@
     </w:rPr>
   </w:style>
   <w:style w:type="paragraph" w:styleId="15">
+    <w:name w:val="endnote text"/>
+    <w:link w:val="20"/>
+    <w:semiHidden/>
+    <w:unhideWhenUsed/>
+    <w:qFormat/>
+    <w:uiPriority w:val="99"/>
+    <w:pPr>
+      <w:spacing w:after="0" w:line="240" w:lineRule="auto"/>
+    </w:pPr>
+    <w:rPr>
+      <w:rFonts w:ascii="Arial" w:hAnsi="Arial" w:eastAsia="Arial" w:cs="Arial"/>
+      <w:sz w:val="20"/>
+      <w:szCs w:val="20"/>
+    </w:rPr>
+  </w:style>
+  <w:style w:type="paragraph" w:styleId="16">
+    <w:name w:val="header"/>
+    <w:basedOn w:val="1"/>
+    <w:uiPriority w:val="0"/>
+    <w:pPr>
+      <w:tabs>
+        <w:tab w:val="center" w:pos="4153"/>
+        <w:tab w:val="right" w:pos="8306"/>
+      </w:tabs>
+    </w:pPr>
+  </w:style>
+  <w:style w:type="paragraph" w:styleId="17">
     <w:name w:val="Title"/>
     <w:qFormat/>
     <w:uiPriority w:val="0"/>
@@ -31465,7 +31540,7 @@
       <w:szCs w:val="56"/>
     </w:rPr>
   </w:style>
-  <w:style w:type="paragraph" w:styleId="16">
+  <w:style w:type="paragraph" w:styleId="18">
     <w:name w:val="List Paragraph"/>
     <w:qFormat/>
     <w:uiPriority w:val="0"/>
@@ -31475,9 +31550,9 @@
       <w:szCs w:val="22"/>
     </w:rPr>
   </w:style>
-  <w:style w:type="character" w:customStyle="1" w:styleId="17">
+  <w:style w:type="character" w:customStyle="1" w:styleId="19">
     <w:name w:val="Footnote Text Char"/>
-    <w:link w:val="13"/>
+    <w:link w:val="14"/>
     <w:semiHidden/>
     <w:unhideWhenUsed/>
     <w:uiPriority w:val="99"/>
@@ -31486,9 +31561,9 @@
       <w:szCs w:val="20"/>
     </w:rPr>
   </w:style>
-  <w:style w:type="character" w:customStyle="1" w:styleId="18">
+  <w:style w:type="character" w:customStyle="1" w:styleId="20">
     <w:name w:val="Endnote Text Char"/>
-    <w:link w:val="14"/>
+    <w:link w:val="15"/>
     <w:semiHidden/>
     <w:unhideWhenUsed/>
     <w:qFormat/>

</xml_diff>